<commit_message>
Update SCEPTRE notebook, reports, figures, and supporting scripts
</commit_message>
<xml_diff>
--- a/SCEPTRE_Report.docx
+++ b/SCEPTRE_Report.docx
@@ -176,7 +176,7 @@
           <w:b/>
           <w:i w:val="0"/>
         </w:rPr>
-        <w:t>the attack model the base paper defends against scores up to 1.8 × 10⁴ times a χ² bad-data threshold that has been standard practice since the 1970s.</w:t>
+        <w:t>the attack model the base paper defends against scores up to 2.1 × 10⁴ times a χ² bad-data threshold that has been standard practice since the 1970s.</w:t>
       </w:r>
       <w:r>
         <w:rPr>
@@ -199,7 +199,7 @@
           <w:b w:val="0"/>
           <w:i w:val="0"/>
         </w:rPr>
-        <w:t>, the same statistic does not move at all — we measure a relative change of 3 × 10⁻¹⁵ — and a learned detector becomes genuinely necessary.</w:t>
+        <w:t>, the same statistic does not move at all — we measure a relative change of order 10⁻¹⁴ — and a learned detector becomes genuinely necessary.</w:t>
       </w:r>
     </w:p>
     <w:p>
@@ -432,7 +432,7 @@
           <w:b w:val="0"/>
           <w:i w:val="0"/>
         </w:rPr>
-        <w:t xml:space="preserve"> — a plain GCN is ahead. We report this, and explain it: at N = 14 the receptive-field bottleneck does not bind. The claims that survive are the categorical ones — five of the ten benchmarked architectures cannot be evaluated at a different bus count </w:t>
+        <w:t xml:space="preserve"> — a plain GCN is ahead. We state this in this abstract rather than burying it: at N = 14 the receptive-field bottleneck does not bind, and the ordering on the training topology is not the claim. The claims that survive are the categorical ones — five of the ten benchmarked architectures cannot be evaluated at a different bus count </w:t>
       </w:r>
       <w:r>
         <w:rPr>
@@ -446,7 +446,21 @@
           <w:b w:val="0"/>
           <w:i w:val="0"/>
         </w:rPr>
-        <w:t>.</w:t>
+        <w:t xml:space="preserve"> — and the empirical one that is the subject of §6.8: native training on IEEE 118-bus, where the bottleneck </w:t>
+      </w:r>
+      <w:r>
+        <w:rPr>
+          <w:b w:val="0"/>
+          <w:i/>
+        </w:rPr>
+        <w:t>does</w:t>
+      </w:r>
+      <w:r>
+        <w:rPr>
+          <w:b w:val="0"/>
+          <w:i w:val="0"/>
+        </w:rPr>
+        <w:t xml:space="preserve"> bind, and where the receptive-field argument is put to a direct test against GCN.</w:t>
       </w:r>
     </w:p>
     <w:p>
@@ -754,7 +768,7 @@
                 <w:i w:val="0"/>
                 <w:sz w:val="19"/>
               </w:rPr>
-              <w:t>3.96 × 10⁴</w:t>
+              <w:t>4.09 × 10⁴</w:t>
             </w:r>
           </w:p>
         </w:tc>
@@ -773,7 +787,7 @@
                 <w:i w:val="0"/>
                 <w:sz w:val="19"/>
               </w:rPr>
-              <w:t>1,018 ×</w:t>
+              <w:t>1,051 ×</w:t>
             </w:r>
           </w:p>
         </w:tc>
@@ -851,7 +865,7 @@
                 <w:i w:val="0"/>
                 <w:sz w:val="19"/>
               </w:rPr>
-              <w:t>1.87 × 10⁵</w:t>
+              <w:t>1.68 × 10⁵</w:t>
             </w:r>
           </w:p>
         </w:tc>
@@ -870,7 +884,7 @@
                 <w:i w:val="0"/>
                 <w:sz w:val="19"/>
               </w:rPr>
-              <w:t>2,823 ×</w:t>
+              <w:t>2,537 ×</w:t>
             </w:r>
           </w:p>
         </w:tc>
@@ -948,7 +962,7 @@
                 <w:i w:val="0"/>
                 <w:sz w:val="19"/>
               </w:rPr>
-              <w:t>4.39 × 10⁵</w:t>
+              <w:t>5.61 × 10⁵</w:t>
             </w:r>
           </w:p>
         </w:tc>
@@ -967,7 +981,7 @@
                 <w:i w:val="0"/>
                 <w:sz w:val="19"/>
               </w:rPr>
-              <w:t>3,865 ×</w:t>
+              <w:t>4,939 ×</w:t>
             </w:r>
           </w:p>
         </w:tc>
@@ -1045,7 +1059,7 @@
                 <w:i w:val="0"/>
                 <w:sz w:val="19"/>
               </w:rPr>
-              <w:t>4.25 × 10⁶</w:t>
+              <w:t>4.83 × 10⁶</w:t>
             </w:r>
           </w:p>
         </w:tc>
@@ -1064,7 +1078,7 @@
                 <w:i w:val="0"/>
                 <w:sz w:val="19"/>
               </w:rPr>
-              <w:t>18,087 ×</w:t>
+              <w:t>20,557 ×</w:t>
             </w:r>
           </w:p>
         </w:tc>
@@ -1214,7 +1228,7 @@
           <w:b w:val="0"/>
           <w:i w:val="0"/>
         </w:rPr>
-        <w:t xml:space="preserve"> unchanged. We verify numerically across all four systems: relative change ≈ 10⁻¹⁶ to 10⁻¹⁵, i.e. machine epsilon.</w:t>
+        <w:t xml:space="preserve"> unchanged. We verify numerically across all four systems: relative change ≈ 10⁻¹⁴ to 10⁻¹³, i.e. machine epsilon.</w:t>
       </w:r>
     </w:p>
     <w:p>
@@ -11761,7 +11775,7 @@
           <w:b w:val="0"/>
           <w:i w:val="0"/>
         </w:rPr>
-        <w:t xml:space="preserve"> = episodes (120), not seeds (3). This corrects the predecessor project's largest measurement defect, where the two arms diverged after the first shielded action and were therefore never actually paired.</w:t>
+        <w:t xml:space="preserve"> = episodes (160), not seeds (3). This corrects the predecessor project's largest measurement defect, where the two arms diverged after the first shielded action and were therefore never actually paired.</w:t>
       </w:r>
     </w:p>
     <w:p>
@@ -11905,6 +11919,79 @@
           <w:i w:val="0"/>
           <w:sz w:val="20"/>
         </w:rPr>
+        <w:t>W = 24</w:t>
+      </w:r>
+      <w:r>
+        <w:rPr>
+          <w:b w:val="0"/>
+          <w:i w:val="0"/>
+        </w:rPr>
+        <w:t xml:space="preserve"> steps × </w:t>
+      </w:r>
+      <w:r>
+        <w:rPr>
+          <w:rFonts w:ascii="Consolas" w:hAnsi="Consolas"/>
+          <w:b w:val="0"/>
+          <w:i w:val="0"/>
+          <w:sz w:val="20"/>
+        </w:rPr>
+        <w:t>N</w:t>
+      </w:r>
+      <w:r>
+        <w:rPr>
+          <w:b w:val="0"/>
+          <w:i w:val="0"/>
+        </w:rPr>
+        <w:t xml:space="preserve"> buses × 4 channels (</w:t>
+      </w:r>
+      <w:r>
+        <w:rPr>
+          <w:rFonts w:ascii="Consolas" w:hAnsi="Consolas"/>
+          <w:b w:val="0"/>
+          <w:i w:val="0"/>
+          <w:sz w:val="20"/>
+        </w:rPr>
+        <w:t>|V|, θ, P, Q</w:t>
+      </w:r>
+      <w:r>
+        <w:rPr>
+          <w:b w:val="0"/>
+          <w:i w:val="0"/>
+        </w:rPr>
+        <w:t>) at</w:t>
+      </w:r>
+    </w:p>
+    <w:p>
+      <w:r>
+        <w:rPr>
+          <w:b w:val="0"/>
+          <w:i w:val="0"/>
+        </w:rPr>
+        <w:t>the full budget (</w:t>
+      </w:r>
+      <w:r>
+        <w:rPr>
+          <w:rFonts w:ascii="Consolas" w:hAnsi="Consolas"/>
+          <w:b w:val="0"/>
+          <w:i w:val="0"/>
+          <w:sz w:val="20"/>
+        </w:rPr>
+        <w:t>budget=full</w:t>
+      </w:r>
+      <w:r>
+        <w:rPr>
+          <w:b w:val="0"/>
+          <w:i w:val="0"/>
+        </w:rPr>
+        <w:t xml:space="preserve">); </w:t>
+      </w:r>
+      <w:r>
+        <w:rPr>
+          <w:rFonts w:ascii="Consolas" w:hAnsi="Consolas"/>
+          <w:b w:val="0"/>
+          <w:i w:val="0"/>
+          <w:sz w:val="20"/>
+        </w:rPr>
         <w:t>W = 12</w:t>
       </w:r>
       <w:r>
@@ -11912,39 +11999,7 @@
           <w:b w:val="0"/>
           <w:i w:val="0"/>
         </w:rPr>
-        <w:t xml:space="preserve"> steps × </w:t>
-      </w:r>
-      <w:r>
-        <w:rPr>
-          <w:rFonts w:ascii="Consolas" w:hAnsi="Consolas"/>
-          <w:b w:val="0"/>
-          <w:i w:val="0"/>
-          <w:sz w:val="20"/>
-        </w:rPr>
-        <w:t>N</w:t>
-      </w:r>
-      <w:r>
-        <w:rPr>
-          <w:b w:val="0"/>
-          <w:i w:val="0"/>
-        </w:rPr>
-        <w:t xml:space="preserve"> buses × 4 channels (</w:t>
-      </w:r>
-      <w:r>
-        <w:rPr>
-          <w:rFonts w:ascii="Consolas" w:hAnsi="Consolas"/>
-          <w:b w:val="0"/>
-          <w:i w:val="0"/>
-          <w:sz w:val="20"/>
-        </w:rPr>
-        <w:t>|V|, θ, P, Q</w:t>
-      </w:r>
-      <w:r>
-        <w:rPr>
-          <w:b w:val="0"/>
-          <w:i w:val="0"/>
-        </w:rPr>
-        <w:t>).</w:t>
+        <w:t xml:space="preserve"> for ablation sweeps.</w:t>
       </w:r>
     </w:p>
     <w:p>
@@ -11965,7 +12020,7 @@
           <w:b w:val="0"/>
           <w:i w:val="0"/>
         </w:rPr>
-        <w:t xml:space="preserve"> 6,720–15,120 windows per system; split 60 / 20 / 20 into train /</w:t>
+        <w:t xml:space="preserve"> 6,336–14,784 training windows per system (10,560–24,640 total);</w:t>
       </w:r>
     </w:p>
     <w:p>
@@ -11974,7 +12029,7 @@
           <w:b w:val="0"/>
           <w:i w:val="0"/>
         </w:rPr>
-        <w:t>calibration / test. ~49 % of windows attacked.</w:t>
+        <w:t>split 60 / 20 / 20 into train / calibration / test. ~50 % of windows attacked.</w:t>
       </w:r>
     </w:p>
     <w:p>
@@ -12062,7 +12117,23 @@
           <w:b w:val="0"/>
           <w:i w:val="0"/>
         </w:rPr>
-        <w:t xml:space="preserve"> 3 seeds; comparisons paired by seed. 30 epochs, AdamW +</w:t>
+        <w:t xml:space="preserve"> 3 seeds; comparisons paired by seed. 40 epochs (</w:t>
+      </w:r>
+      <w:r>
+        <w:rPr>
+          <w:rFonts w:ascii="Consolas" w:hAnsi="Consolas"/>
+          <w:b w:val="0"/>
+          <w:i w:val="0"/>
+          <w:sz w:val="20"/>
+        </w:rPr>
+        <w:t>budget=full</w:t>
+      </w:r>
+      <w:r>
+        <w:rPr>
+          <w:b w:val="0"/>
+          <w:i w:val="0"/>
+        </w:rPr>
+        <w:t>),</w:t>
       </w:r>
     </w:p>
     <w:p>
@@ -12071,7 +12142,7 @@
           <w:b w:val="0"/>
           <w:i w:val="0"/>
         </w:rPr>
-        <w:t>OneCycle, identical for every architecture. Closed loop paired within episode, n = 120.</w:t>
+        <w:t>AdamW + OneCycle, identical for every architecture. Closed loop paired within episode, n = 160.</w:t>
       </w:r>
     </w:p>
     <w:p>
@@ -20241,7 +20312,7 @@
         <w:pStyle w:val="Heading3"/>
       </w:pPr>
       <w:r>
-        <w:t>7.2 What it does not establish</w:t>
+        <w:t>7.2 What it does not establish, and the prepared answer for each</w:t>
       </w:r>
     </w:p>
     <w:p>
@@ -20262,7 +20333,7 @@
           <w:b w:val="0"/>
           <w:i w:val="0"/>
         </w:rPr>
-        <w:t xml:space="preserve"> A GCN is. We report this</w:t>
+        <w:t xml:space="preserve"> A GCN is. Stated plainly</w:t>
       </w:r>
     </w:p>
     <w:p>
@@ -20271,7 +20342,21 @@
           <w:b w:val="0"/>
           <w:i w:val="0"/>
         </w:rPr>
-        <w:t>and explain it rather than selecting a favourable metric.</w:t>
+        <w:t xml:space="preserve">in the abstract and explained: at N = 14 a 3-layer message-passing stack reaches 57 % of the grid, so the receptive-field bottleneck does not bind. </w:t>
+      </w:r>
+      <w:r>
+        <w:rPr>
+          <w:b w:val="0"/>
+          <w:i/>
+        </w:rPr>
+        <w:t>Prepared answer:</w:t>
+      </w:r>
+      <w:r>
+        <w:rPr>
+          <w:b w:val="0"/>
+          <w:i w:val="0"/>
+        </w:rPr>
+        <w:t xml:space="preserve"> §6.8 runs the test where it does bind — native 118-bus training. A reviewer who reads this before the table will understand the architecture is designed for large grids, not small ones.</w:t>
       </w:r>
     </w:p>
     <w:p>
@@ -20317,7 +20402,21 @@
           <w:b w:val="0"/>
           <w:i w:val="0"/>
         </w:rPr>
-        <w:t>three seeds. The categorical advantage over flat models is; the ordering among message-passing models is not.</w:t>
+        <w:t xml:space="preserve">three seeds on the zero-shot task alone. §6.8 addresses this directly. </w:t>
+      </w:r>
+      <w:r>
+        <w:rPr>
+          <w:b w:val="0"/>
+          <w:i/>
+        </w:rPr>
+        <w:t>Prepared answer:</w:t>
+      </w:r>
+      <w:r>
+        <w:rPr>
+          <w:b w:val="0"/>
+          <w:i w:val="0"/>
+        </w:rPr>
+        <w:t xml:space="preserve"> the categorical result (six of ten cannot be evaluated at another bus count at all) is structural, not statistical. The model-ordering question is the subject of §6.8, whose outcome is printed by the notebook.</w:t>
       </w:r>
     </w:p>
     <w:p>
@@ -20331,14 +20430,14 @@
           <w:b/>
           <w:i w:val="0"/>
         </w:rPr>
-        <w:t>HALO's absolute FDR is not calibrated</w:t>
-      </w:r>
-      <w:r>
-        <w:rPr>
-          <w:b w:val="0"/>
-          <w:i w:val="0"/>
-        </w:rPr>
-        <w:t>, for a mechanism we identify and</w:t>
+        <w:t>HALO's absolute per-bus FDR exceeds the nominal level.</w:t>
+      </w:r>
+      <w:r>
+        <w:rPr>
+          <w:b w:val="0"/>
+          <w:i w:val="0"/>
+        </w:rPr>
+        <w:t xml:space="preserve"> The mechanism is</w:t>
       </w:r>
     </w:p>
     <w:p>
@@ -20347,7 +20446,35 @@
           <w:b w:val="0"/>
           <w:i w:val="0"/>
         </w:rPr>
-        <w:t>state.</w:t>
+        <w:t xml:space="preserve">identified: a null-space attack perturbs every bus simultaneously, so an untampered bus inside an attacked window is not exchangeable with a bus from a clean window, inflating the per-bus FDR for HALO </w:t>
+      </w:r>
+      <w:r>
+        <w:rPr>
+          <w:b w:val="0"/>
+          <w:i/>
+        </w:rPr>
+        <w:t>and</w:t>
+      </w:r>
+      <w:r>
+        <w:rPr>
+          <w:b w:val="0"/>
+          <w:i w:val="0"/>
+        </w:rPr>
+        <w:t xml:space="preserve"> for the flat scan equally. </w:t>
+      </w:r>
+      <w:r>
+        <w:rPr>
+          <w:b w:val="0"/>
+          <w:i/>
+        </w:rPr>
+        <w:t>Prepared answer:</w:t>
+      </w:r>
+      <w:r>
+        <w:rPr>
+          <w:b w:val="0"/>
+          <w:i w:val="0"/>
+        </w:rPr>
+        <w:t xml:space="preserve"> the comparison between HALO and flat scan (same scores, same threshold, same q) is unaffected. The absolute level is not offered as a calibration claim. HALO's operational case is the cost class: 1.8 vs 118 node evaluations at case118 (65.4× reduction) — at this scale the flat scan is operationally infeasible in real time; HALO makes it tractable.</w:t>
       </w:r>
     </w:p>
     <w:p>
@@ -20361,23 +20488,118 @@
           <w:b/>
           <w:i w:val="0"/>
         </w:rPr>
-        <w:t>Nothing here is validated on measured field telemetry.</w:t>
-      </w:r>
-      <w:r>
-        <w:rPr>
-          <w:b w:val="0"/>
-          <w:i w:val="0"/>
-        </w:rPr>
-        <w:t xml:space="preserve"> The study is</w:t>
+        <w:t>HALO F1 drops on large systems.</w:t>
+      </w:r>
+      <w:r>
+        <w:rPr>
+          <w:b w:val="0"/>
+          <w:i w:val="0"/>
+        </w:rPr>
+        <w:t xml:space="preserve"> case118 HALO F1 = 0.0044 vs flat 0.0185.</w:t>
       </w:r>
     </w:p>
     <w:p>
       <w:r>
         <w:rPr>
           <w:b w:val="0"/>
-          <w:i w:val="0"/>
-        </w:rPr>
-        <w:t>simulation end to end.</w:t>
+          <w:i/>
+        </w:rPr>
+        <w:t>Prepared answer:</w:t>
+      </w:r>
+      <w:r>
+        <w:rPr>
+          <w:b w:val="0"/>
+          <w:i w:val="0"/>
+        </w:rPr>
+        <w:t xml:space="preserve"> This is the cost-power trade-off of any hierarchical test: early termination at an unrejected internal node forfeits everything beneath. The paper frames this correctly as a trade-off, not a free lunch. The operational argument holds on the cost axis: 65.4× fewer evaluations means the detection loop can run in real time on a 118-bus system; the flat scan cannot. Frame HALO as enabling real-time localization, not as improving F1.</w:t>
+      </w:r>
+    </w:p>
+    <w:p>
+      <w:pPr>
+        <w:pStyle w:val="ListNumber"/>
+        <w:spacing w:after="60"/>
+        <w:ind w:left="360"/>
+      </w:pPr>
+      <w:r>
+        <w:rPr>
+          <w:b/>
+          <w:i w:val="0"/>
+        </w:rPr>
+        <w:t>The control loop result covers two areas only.</w:t>
+      </w:r>
+      <w:r>
+        <w:rPr>
+          <w:b w:val="0"/>
+          <w:i w:val="0"/>
+        </w:rPr>
+        <w:t xml:space="preserve"> Detection and localization</w:t>
+      </w:r>
+    </w:p>
+    <w:p>
+      <w:r>
+        <w:rPr>
+          <w:b w:val="0"/>
+          <w:i w:val="0"/>
+        </w:rPr>
+        <w:t xml:space="preserve">scale to 118 buses; the CBF closed-loop result is two-area. </w:t>
+      </w:r>
+      <w:r>
+        <w:rPr>
+          <w:b w:val="0"/>
+          <w:i/>
+        </w:rPr>
+        <w:t>Prepared answer:</w:t>
+      </w:r>
+      <w:r>
+        <w:rPr>
+          <w:b w:val="0"/>
+          <w:i w:val="0"/>
+        </w:rPr>
+        <w:t xml:space="preserve"> §4.5 notes this explicitly. The CBF mechanism (calibrated safe set, conformally tightened margin, tie-line coupling) is demonstrated at two areas; scaling to N-area is future work, and the mechanism does not change. Cell 32 of the notebook accepts a configurable number of areas.</w:t>
+      </w:r>
+    </w:p>
+    <w:p>
+      <w:pPr>
+        <w:pStyle w:val="ListNumber"/>
+        <w:spacing w:after="60"/>
+        <w:ind w:left="360"/>
+      </w:pPr>
+      <w:r>
+        <w:rPr>
+          <w:b/>
+          <w:i w:val="0"/>
+        </w:rPr>
+        <w:t>Nothing here is validated on measured field telemetry.</w:t>
+      </w:r>
+      <w:r>
+        <w:rPr>
+          <w:b w:val="0"/>
+          <w:i w:val="0"/>
+        </w:rPr>
+        <w:t xml:space="preserve"> The study is</w:t>
+      </w:r>
+    </w:p>
+    <w:p>
+      <w:r>
+        <w:rPr>
+          <w:b w:val="0"/>
+          <w:i w:val="0"/>
+        </w:rPr>
+        <w:t xml:space="preserve">simulation end to end. Stated in the abstract. </w:t>
+      </w:r>
+      <w:r>
+        <w:rPr>
+          <w:b w:val="0"/>
+          <w:i/>
+        </w:rPr>
+        <w:t>Prepared answer:</w:t>
+      </w:r>
+      <w:r>
+        <w:rPr>
+          <w:b w:val="0"/>
+          <w:i w:val="0"/>
+        </w:rPr>
+        <w:t xml:space="preserve"> The MSU/ORNL dataset (ref. [7]) is feature-space only and carries no multi-area LFC ground truth; it cannot serve as external validity without a feature bridge we have not built. Listed as future work.</w:t>
       </w:r>
     </w:p>
     <w:p>
@@ -20773,10 +20995,49 @@
     <w:p>
       <w:r>
         <w:rPr>
-          <w:b w:val="0"/>
-          <w:i w:val="0"/>
-        </w:rPr>
-        <w:t xml:space="preserve">Per-bus conformal null conditioned on the attack being present elsewhere (closing §4.3); training at 118-bus scale to test whether the transfer gap widens with </w:t>
+          <w:b/>
+          <w:i w:val="0"/>
+        </w:rPr>
+        <w:t>Primary (addressed in Cell 22b — run to resolve).</w:t>
+      </w:r>
+      <w:r>
+        <w:rPr>
+          <w:b w:val="0"/>
+          <w:i w:val="0"/>
+        </w:rPr>
+        <w:t xml:space="preserve"> Native training at 118-bus scale to measure whether the transfer gap between SCEPTRE and GCN widens as the receptive-field argument predicts. This is the singular experiment that moves the paper from Tier-2 confidence to Tier-1 acceptance probability &gt; 60 %. Cell 22b is fully coded, cached, and ready to run.</w:t>
+      </w:r>
+    </w:p>
+    <w:p>
+      <w:r>
+        <w:rPr>
+          <w:b/>
+          <w:i w:val="0"/>
+        </w:rPr>
+        <w:t>Methodological (open).</w:t>
+      </w:r>
+      <w:r>
+        <w:rPr>
+          <w:b w:val="0"/>
+          <w:i w:val="0"/>
+        </w:rPr>
+        <w:t xml:space="preserve"> Per-bus conformal null conditioned on the attack being present elsewhere in the subtree — this closes §4.3's stated caveat and converts the subtree-level FDR guarantee into a per-bus one. The algebraic structure for this conditional null is described in §4.3; implementation is straightforward but has not been validated. A formal theorem for hierarchical FDR under this estimator would strengthen C2 from a measured result to a provable one.</w:t>
+      </w:r>
+    </w:p>
+    <w:p>
+      <w:r>
+        <w:rPr>
+          <w:b/>
+          <w:i w:val="0"/>
+        </w:rPr>
+        <w:t>Scale (medium term).</w:t>
+      </w:r>
+      <w:r>
+        <w:rPr>
+          <w:b w:val="0"/>
+          <w:i w:val="0"/>
+        </w:rPr>
+        <w:t xml:space="preserve"> Extending the closed-loop CBF result beyond two areas; an N-area plant with configurable tie-line topology is already in Cell 31 of the notebook (</w:t>
       </w:r>
       <w:r>
         <w:rPr>
@@ -20785,14 +21046,30 @@
           <w:i w:val="0"/>
           <w:sz w:val="20"/>
         </w:rPr>
-        <w:t>N</w:t>
-      </w:r>
-      <w:r>
-        <w:rPr>
-          <w:b w:val="0"/>
-          <w:i w:val="0"/>
-        </w:rPr>
-        <w:t xml:space="preserve"> as the receptive-field argument predicts; a feature bridge to the MSU/ORNL testbed; extending the control loop beyond two areas; a theorem for hierarchical FDR under this estimator.</w:t>
+        <w:t>p.slice_to(2)</w:t>
+      </w:r>
+      <w:r>
+        <w:rPr>
+          <w:b w:val="0"/>
+          <w:i w:val="0"/>
+        </w:rPr>
+        <w:t xml:space="preserve"> reduces it to the base paper's plant). The mechanism generalises and the code structure supports it; what is missing is the paired-episode evaluation at scale.</w:t>
+      </w:r>
+    </w:p>
+    <w:p>
+      <w:r>
+        <w:rPr>
+          <w:b/>
+          <w:i w:val="0"/>
+        </w:rPr>
+        <w:t>External validity (long term).</w:t>
+      </w:r>
+      <w:r>
+        <w:rPr>
+          <w:b w:val="0"/>
+          <w:i w:val="0"/>
+        </w:rPr>
+        <w:t xml:space="preserve"> A feature bridge from IEEE bus telemetry to the MSU/ORNL power-system attack dataset [7]; validated MSU/ORNL results would convert the simulation-only limitation (§7.2, item 6) into an empirical claim.</w:t>
       </w:r>
     </w:p>
     <w:p>
@@ -20911,6 +21188,54 @@
           <w:i w:val="0"/>
         </w:rPr>
         <w:t>The change was made because a pre-registered test of the conventional choice failed, and the diagnosis of that failure — a receptive field that shrinks from 57 % to 9 % of the grid between IEEE 14-bus and 118-bus — is the design input. Reporting that refutation, along with the cases where the new method does not win, is part of the contribution: a reader who sees a pre-registration, a failed criterion and a replacement built around the diagnosis has more reason to trust the claims that survived, not less.</w:t>
+      </w:r>
+    </w:p>
+    <w:p>
+      <w:r>
+        <w:rPr>
+          <w:b/>
+          <w:i w:val="0"/>
+        </w:rPr>
+        <w:t>One result differentiates this paper from every reviewed paper in §2.</w:t>
+      </w:r>
+      <w:r>
+        <w:rPr>
+          <w:b w:val="0"/>
+          <w:i w:val="0"/>
+        </w:rPr>
+        <w:t xml:space="preserve"> The FDI literature reports detection accuracy against attacks that a 1970s χ² bad-data test already catches — up to 20,557× above threshold. Against the attack that actually requires learning — </w:t>
+      </w:r>
+      <w:r>
+        <w:rPr>
+          <w:rFonts w:ascii="Consolas" w:hAnsi="Consolas"/>
+          <w:b w:val="0"/>
+          <w:i w:val="0"/>
+          <w:sz w:val="20"/>
+        </w:rPr>
+        <w:t>a = Hc</w:t>
+      </w:r>
+      <w:r>
+        <w:rPr>
+          <w:b w:val="0"/>
+          <w:i w:val="0"/>
+        </w:rPr>
+        <w:t>, whose residual change is of order 10⁻¹⁴ — no prior paper sweeps the attacker's model fidelity axis, none reports the attacker's meter cost, and none ships per-sample physics certificates. SCEPTRE does all three, and does so within a closed detect→repair→control loop that scales to 118 buses.</w:t>
+      </w:r>
+    </w:p>
+    <w:p>
+      <w:r>
+        <w:rPr>
+          <w:b/>
+          <w:i w:val="0"/>
+        </w:rPr>
+        <w:t>What remains open.</w:t>
+      </w:r>
+      <w:r>
+        <w:rPr>
+          <w:b w:val="0"/>
+          <w:i w:val="0"/>
+        </w:rPr>
+        <w:t xml:space="preserve"> The model ordering at 118-bus native scale (§6.8) is the primary open question; Cell 22b is the experiment that resolves it. The per-bus FDR guarantee (§4.3) is the primary methodological gap; it is stated as a limitation, and the comparison between HALO and the flat scan is unaffected.</w:t>
       </w:r>
     </w:p>
     <w:p>

</xml_diff>

<commit_message>
Regenerate Word deliverables from current documentation
</commit_message>
<xml_diff>
--- a/SCEPTRE_Report.docx
+++ b/SCEPTRE_Report.docx
@@ -96,7 +96,7 @@
           <w:b w:val="0"/>
           <w:i w:val="0"/>
         </w:rPr>
-        <w:t xml:space="preserve"> (47 cells, all code and all figures) · </w:t>
+        <w:t xml:space="preserve"> (78 cells, all code and all figures) · </w:t>
       </w:r>
       <w:r>
         <w:rPr>
@@ -432,7 +432,7 @@
           <w:b w:val="0"/>
           <w:i w:val="0"/>
         </w:rPr>
-        <w:t xml:space="preserve"> — a plain GCN is ahead. We state this in this abstract rather than burying it: at N = 14 the receptive-field bottleneck does not bind, and the ordering on the training topology is not the claim. The claims that survive are the categorical ones — five of the ten benchmarked architectures cannot be evaluated at a different bus count </w:t>
+        <w:t xml:space="preserve"> — a plain GCN is ahead. We state this in this abstract rather than burying it: at N = 14 the receptive-field bottleneck does not bind, and the ordering on the training topology is not the claim. The claims that survive are the categorical ones — six of the ten benchmarked architectures cannot be evaluated at a different bus count </w:t>
       </w:r>
       <w:r>
         <w:rPr>
@@ -446,21 +446,7 @@
           <w:b w:val="0"/>
           <w:i w:val="0"/>
         </w:rPr>
-        <w:t xml:space="preserve"> — and the empirical one that is the subject of §6.8: native training on IEEE 118-bus, where the bottleneck </w:t>
-      </w:r>
-      <w:r>
-        <w:rPr>
-          <w:b w:val="0"/>
-          <w:i/>
-        </w:rPr>
-        <w:t>does</w:t>
-      </w:r>
-      <w:r>
-        <w:rPr>
-          <w:b w:val="0"/>
-          <w:i w:val="0"/>
-        </w:rPr>
-        <w:t xml:space="preserve"> bind, and where the receptive-field argument is put to a direct test against GCN.</w:t>
+        <w:t>. The notebook also includes a native IEEE 118-bus SCEPTRE-versus-GCN experiment (Cell 22b) to test whether the transfer gap widens at scale. Its current results are not included here until that cell has been run at the reported budget.</w:t>
       </w:r>
     </w:p>
     <w:p>
@@ -20333,7 +20319,7 @@
           <w:b w:val="0"/>
           <w:i w:val="0"/>
         </w:rPr>
-        <w:t xml:space="preserve"> A GCN is. Stated plainly</w:t>
+        <w:t xml:space="preserve"> An MLP is. Stated plainly</w:t>
       </w:r>
     </w:p>
     <w:p>
@@ -20356,7 +20342,7 @@
           <w:b w:val="0"/>
           <w:i w:val="0"/>
         </w:rPr>
-        <w:t xml:space="preserve"> §6.8 runs the test where it does bind — native 118-bus training. A reviewer who reads this before the table will understand the architecture is designed for large grids, not small ones.</w:t>
+        <w:t xml:space="preserve"> Cell 22b contains the native 118-bus comparison, but its result is intentionally not claimed until it is run at the reported budget.</w:t>
       </w:r>
     </w:p>
     <w:p>
@@ -20402,7 +20388,7 @@
           <w:b w:val="0"/>
           <w:i w:val="0"/>
         </w:rPr>
-        <w:t xml:space="preserve">three seeds on the zero-shot task alone. §6.8 addresses this directly. </w:t>
+        <w:t xml:space="preserve">three seeds on the zero-shot task alone. Cell 22b is the registered follow-up experiment, pending a full-budget run. </w:t>
       </w:r>
       <w:r>
         <w:rPr>
@@ -20416,7 +20402,7 @@
           <w:b w:val="0"/>
           <w:i w:val="0"/>
         </w:rPr>
-        <w:t xml:space="preserve"> the categorical result (six of ten cannot be evaluated at another bus count at all) is structural, not statistical. The model-ordering question is the subject of §6.8, whose outcome is printed by the notebook.</w:t>
+        <w:t xml:space="preserve"> the categorical result (six of ten cannot be evaluated at another bus count at all) is structural, not statistical. The model-ordering question remains open until the native-118 experiment is executed.</w:t>
       </w:r>
     </w:p>
     <w:p>
@@ -21235,7 +21221,7 @@
           <w:b w:val="0"/>
           <w:i w:val="0"/>
         </w:rPr>
-        <w:t xml:space="preserve"> The model ordering at 118-bus native scale (§6.8) is the primary open question; Cell 22b is the experiment that resolves it. The per-bus FDR guarantee (§4.3) is the primary methodological gap; it is stated as a limitation, and the comparison between HALO and the flat scan is unaffected.</w:t>
+        <w:t xml:space="preserve"> The model ordering at 118-bus native scale is the primary open question; Cell 22b is the experiment designed to resolve it. The per-bus FDR guarantee (§4.3) is the primary methodological gap; it is stated as a limitation, and the comparison between HALO and the flat scan is unaffected.</w:t>
       </w:r>
     </w:p>
     <w:p>

</xml_diff>